<commit_message>
docs: ic kapak yapisi duzenlendi, tablo fontlari senkronize edildi ve pdf guncellendi
</commit_message>
<xml_diff>
--- a/bitirme ttezi/Bitirme_Tezi_2026_Guncellenmis (1).docx
+++ b/bitirme ttezi/Bitirme_Tezi_2026_Guncellenmis (1).docx
@@ -266,9 +266,6 @@
         <w:t>BİLGİSAYAR MÜHENDİSLİĞİ</w:t>
       </w:r>
     </w:p>
-    <w:p/>
-    <w:p/>
-    <w:p/>
     <w:tbl>
       <w:tblPr>
         <w:tblW w:w="5000" w:type="pct"/>
@@ -472,6 +469,228 @@
         </w:tc>
       </w:tr>
     </w:tbl>
+    <w:p>
+      <w:pPr>
+        <w:spacing w:before="0" w:after="0" w:line="276" w:lineRule="auto"/>
+        <w:jc w:val="center"/>
+      </w:pPr>
+    </w:p>
+    <w:p>
+      <w:pPr>
+        <w:spacing w:before="0" w:after="0" w:line="276" w:lineRule="auto"/>
+        <w:jc w:val="center"/>
+      </w:pPr>
+    </w:p>
+    <w:p>
+      <w:pPr>
+        <w:spacing w:before="0" w:after="0" w:line="276" w:lineRule="auto"/>
+        <w:jc w:val="center"/>
+      </w:pPr>
+    </w:p>
+    <w:p>
+      <w:pPr>
+        <w:spacing w:before="0" w:after="0" w:line="276" w:lineRule="auto"/>
+        <w:jc w:val="center"/>
+      </w:pPr>
+    </w:p>
+    <w:p>
+      <w:pPr>
+        <w:spacing w:before="0" w:after="0" w:line="276" w:lineRule="auto"/>
+        <w:jc w:val="center"/>
+      </w:pPr>
+    </w:p>
+    <w:p>
+      <w:pPr>
+        <w:spacing w:before="0" w:after="0" w:line="276" w:lineRule="auto"/>
+        <w:jc w:val="center"/>
+      </w:pPr>
+    </w:p>
+    <w:p>
+      <w:pPr>
+        <w:spacing w:before="0" w:after="0" w:line="276" w:lineRule="auto"/>
+        <w:jc w:val="center"/>
+      </w:pPr>
+    </w:p>
+    <w:p>
+      <w:pPr>
+        <w:spacing w:before="0" w:after="0" w:line="276" w:lineRule="auto"/>
+        <w:jc w:val="center"/>
+      </w:pPr>
+    </w:p>
+    <w:p>
+      <w:pPr>
+        <w:spacing w:before="0" w:after="0" w:line="276" w:lineRule="auto"/>
+        <w:jc w:val="center"/>
+      </w:pPr>
+    </w:p>
+    <w:p>
+      <w:pPr>
+        <w:spacing w:before="0" w:after="0" w:line="276" w:lineRule="auto"/>
+        <w:jc w:val="center"/>
+      </w:pPr>
+    </w:p>
+    <w:p>
+      <w:pPr>
+        <w:spacing w:before="0" w:after="0" w:line="276" w:lineRule="auto"/>
+        <w:jc w:val="center"/>
+      </w:pPr>
+    </w:p>
+    <w:p>
+      <w:pPr>
+        <w:spacing w:before="0" w:after="0" w:line="276" w:lineRule="auto"/>
+        <w:jc w:val="center"/>
+      </w:pPr>
+    </w:p>
+    <w:p>
+      <w:pPr>
+        <w:spacing w:before="0" w:after="0" w:line="276" w:lineRule="auto"/>
+        <w:jc w:val="center"/>
+      </w:pPr>
+    </w:p>
+    <w:p>
+      <w:pPr>
+        <w:spacing w:before="0" w:after="0" w:line="276" w:lineRule="auto"/>
+        <w:jc w:val="center"/>
+      </w:pPr>
+    </w:p>
+    <w:p>
+      <w:pPr>
+        <w:spacing w:before="0" w:after="0" w:line="276" w:lineRule="auto"/>
+        <w:jc w:val="center"/>
+      </w:pPr>
+      <w:r>
+        <w:rPr>
+          <w:b/>
+          <w:sz w:val="22"/>
+        </w:rPr>
+        <w:t>YAPAY ZEKÂ DESTEKLİ VE KİŞİSELLEŞTİRİLMİŞ</w:t>
+      </w:r>
+    </w:p>
+    <w:p>
+      <w:pPr>
+        <w:spacing w:before="0" w:after="0" w:line="276" w:lineRule="auto"/>
+        <w:jc w:val="center"/>
+      </w:pPr>
+      <w:r>
+        <w:rPr>
+          <w:b/>
+          <w:sz w:val="22"/>
+        </w:rPr>
+        <w:t>ALIŞKANLIK TAKİP SİSTEMİ</w:t>
+      </w:r>
+    </w:p>
+    <w:p>
+      <w:pPr>
+        <w:spacing w:before="0" w:after="0" w:line="276" w:lineRule="auto"/>
+        <w:jc w:val="center"/>
+      </w:pPr>
+    </w:p>
+    <w:p>
+      <w:pPr>
+        <w:spacing w:before="0" w:after="0" w:line="276" w:lineRule="auto"/>
+        <w:jc w:val="center"/>
+      </w:pPr>
+    </w:p>
+    <w:p>
+      <w:pPr>
+        <w:spacing w:before="0" w:after="0" w:line="276" w:lineRule="auto"/>
+        <w:jc w:val="center"/>
+      </w:pPr>
+    </w:p>
+    <w:p>
+      <w:pPr>
+        <w:spacing w:before="0" w:after="0" w:line="276" w:lineRule="auto"/>
+        <w:jc w:val="center"/>
+      </w:pPr>
+    </w:p>
+    <w:p>
+      <w:pPr>
+        <w:spacing w:before="0" w:after="0" w:line="276" w:lineRule="auto"/>
+        <w:jc w:val="center"/>
+      </w:pPr>
+      <w:r>
+        <w:rPr>
+          <w:b/>
+          <w:sz w:val="22"/>
+        </w:rPr>
+        <w:t>Emirhan ÇELEN</w:t>
+      </w:r>
+    </w:p>
+    <w:p>
+      <w:pPr>
+        <w:spacing w:before="0" w:after="0" w:line="276" w:lineRule="auto"/>
+        <w:jc w:val="center"/>
+      </w:pPr>
+      <w:r>
+        <w:rPr>
+          <w:b/>
+          <w:sz w:val="22"/>
+        </w:rPr>
+        <w:t>Yunus Emre YILMAZ</w:t>
+      </w:r>
+    </w:p>
+    <w:p>
+      <w:pPr>
+        <w:spacing w:before="0" w:after="0" w:line="276" w:lineRule="auto"/>
+        <w:jc w:val="center"/>
+      </w:pPr>
+    </w:p>
+    <w:p>
+      <w:pPr>
+        <w:spacing w:before="0" w:after="0" w:line="276" w:lineRule="auto"/>
+        <w:jc w:val="center"/>
+      </w:pPr>
+    </w:p>
+    <w:p>
+      <w:pPr>
+        <w:spacing w:before="0" w:after="0" w:line="276" w:lineRule="auto"/>
+        <w:jc w:val="center"/>
+      </w:pPr>
+      <w:r>
+        <w:rPr>
+          <w:b/>
+          <w:sz w:val="22"/>
+        </w:rPr>
+        <w:t>Danışman: Dr. Öğr. Üyesi Latif AKÇAY</w:t>
+      </w:r>
+    </w:p>
+    <w:p>
+      <w:pPr>
+        <w:spacing w:before="0" w:after="0" w:line="276" w:lineRule="auto"/>
+        <w:jc w:val="center"/>
+      </w:pPr>
+    </w:p>
+    <w:p>
+      <w:pPr>
+        <w:spacing w:before="0" w:after="0" w:line="276" w:lineRule="auto"/>
+        <w:jc w:val="center"/>
+      </w:pPr>
+    </w:p>
+    <w:p>
+      <w:pPr>
+        <w:spacing w:before="0" w:after="0" w:line="276" w:lineRule="auto"/>
+        <w:jc w:val="center"/>
+      </w:pPr>
+    </w:p>
+    <w:p>
+      <w:pPr>
+        <w:spacing w:before="0" w:after="0" w:line="276" w:lineRule="auto"/>
+        <w:jc w:val="center"/>
+      </w:pPr>
+    </w:p>
+    <w:p>
+      <w:pPr>
+        <w:spacing w:before="0" w:after="0" w:line="276" w:lineRule="auto"/>
+        <w:jc w:val="center"/>
+      </w:pPr>
+      <w:r>
+        <w:rPr>
+          <w:b/>
+          <w:sz w:val="20"/>
+        </w:rPr>
+        <w:t>TEMMUZ - 2026</w:t>
+      </w:r>
+    </w:p>
     <w:p>
       <w:r>
         <w:br w:type="page"/>
@@ -3383,6 +3602,9 @@
           </w:tcPr>
           <w:p>
             <w:r>
+              <w:rPr>
+                <w:sz w:val="22"/>
+              </w:rPr>
               <w:t>AI</w:t>
             </w:r>
           </w:p>
@@ -3399,6 +3621,9 @@
           </w:tcPr>
           <w:p>
             <w:r>
+              <w:rPr>
+                <w:sz w:val="22"/>
+              </w:rPr>
               <w:t xml:space="preserve">Artificial Intelligence / Yapay Zekâ</w:t>
             </w:r>
           </w:p>
@@ -3423,6 +3648,9 @@
           </w:tcPr>
           <w:p>
             <w:r>
+              <w:rPr>
+                <w:sz w:val="22"/>
+              </w:rPr>
               <w:t>API</w:t>
             </w:r>
           </w:p>
@@ -3439,6 +3667,9 @@
           </w:tcPr>
           <w:p>
             <w:r>
+              <w:rPr>
+                <w:sz w:val="22"/>
+              </w:rPr>
               <w:t xml:space="preserve">Application Programming Interface</w:t>
             </w:r>
           </w:p>
@@ -3463,6 +3694,9 @@
           </w:tcPr>
           <w:p>
             <w:r>
+              <w:rPr>
+                <w:sz w:val="22"/>
+              </w:rPr>
               <w:t>CRUD</w:t>
             </w:r>
           </w:p>
@@ -3479,6 +3713,9 @@
           </w:tcPr>
           <w:p>
             <w:r>
+              <w:rPr>
+                <w:sz w:val="22"/>
+              </w:rPr>
               <w:t xml:space="preserve">Create, Read, Update, Delete</w:t>
             </w:r>
           </w:p>
@@ -3503,6 +3740,9 @@
           </w:tcPr>
           <w:p>
             <w:r>
+              <w:rPr>
+                <w:sz w:val="22"/>
+              </w:rPr>
               <w:t>JSON</w:t>
             </w:r>
           </w:p>
@@ -3519,6 +3759,9 @@
           </w:tcPr>
           <w:p>
             <w:r>
+              <w:rPr>
+                <w:sz w:val="22"/>
+              </w:rPr>
               <w:t xml:space="preserve">JavaScript Object Notation</w:t>
             </w:r>
           </w:p>
@@ -3543,6 +3786,9 @@
           </w:tcPr>
           <w:p>
             <w:r>
+              <w:rPr>
+                <w:sz w:val="22"/>
+              </w:rPr>
               <w:t>ML</w:t>
             </w:r>
           </w:p>
@@ -3559,6 +3805,9 @@
           </w:tcPr>
           <w:p>
             <w:r>
+              <w:rPr>
+                <w:sz w:val="22"/>
+              </w:rPr>
               <w:t>Machine Learning / Makine Öğrenmesi</w:t>
             </w:r>
           </w:p>
@@ -3583,6 +3832,9 @@
           </w:tcPr>
           <w:p>
             <w:r>
+              <w:rPr>
+                <w:sz w:val="22"/>
+              </w:rPr>
               <w:t>NLP</w:t>
             </w:r>
           </w:p>
@@ -3599,6 +3851,9 @@
           </w:tcPr>
           <w:p>
             <w:r>
+              <w:rPr>
+                <w:sz w:val="22"/>
+              </w:rPr>
               <w:t xml:space="preserve">Natural Language Processing / Doğal Dil İşleme</w:t>
             </w:r>
           </w:p>
@@ -3623,6 +3878,9 @@
           </w:tcPr>
           <w:p>
             <w:r>
+              <w:rPr>
+                <w:sz w:val="22"/>
+              </w:rPr>
               <w:t>UI</w:t>
             </w:r>
           </w:p>
@@ -3639,6 +3897,9 @@
           </w:tcPr>
           <w:p>
             <w:r>
+              <w:rPr>
+                <w:sz w:val="22"/>
+              </w:rPr>
               <w:t xml:space="preserve">User Interface / Kullanıcı Arayüzü</w:t>
             </w:r>
           </w:p>
@@ -3663,6 +3924,9 @@
           </w:tcPr>
           <w:p>
             <w:r>
+              <w:rPr>
+                <w:sz w:val="22"/>
+              </w:rPr>
               <w:t>UX</w:t>
             </w:r>
           </w:p>
@@ -3679,6 +3943,9 @@
           </w:tcPr>
           <w:p>
             <w:r>
+              <w:rPr>
+                <w:sz w:val="22"/>
+              </w:rPr>
               <w:t xml:space="preserve">User Experience / Kullanıcı Deneyimi</w:t>
             </w:r>
           </w:p>

</xml_diff>